<commit_message>
Document Stanford species labeling and rooftop-overlap tree filtering
- Add a Rooftop-Overlap Filtering method and report that ~43% of raw
  Stanford canopies were pruned for sitting on building footprints.
- Describe Stanford's top-six labeled genera (coast live oak ~40%, palm,
  eucalyptus, redwood, valley oak, olive) anchored to the Stanford tree
  inventory, with citations added to the bibliography.
- Add Palm/Olive/Eucalyptus to the emission and phenology tables.
- Rebuild paper.pdf and paper.docx.

Co-authored-by: Cursor <cursoragent@cursor.com>
</commit_message>
<xml_diff>
--- a/docs/paper.docx
+++ b/docs/paper.docx
@@ -13122,6 +13122,120 @@
           </w:p>
         </w:tc>
       </w:tr>
+      <w:tr>
+        <w:tc>
+          <w:tcPr/>
+          <w:p>
+            <w:pPr>
+              <w:pStyle w:val="Compact"/>
+              <w:jc w:val="left"/>
+            </w:pPr>
+            <w:r>
+              <w:t xml:space="preserve">Canary Island Palm</w:t>
+            </w:r>
+          </w:p>
+        </w:tc>
+        <w:tc>
+          <w:tcPr/>
+          <w:p>
+            <w:pPr>
+              <w:pStyle w:val="Compact"/>
+              <w:jc w:val="center"/>
+            </w:pPr>
+            <w:r>
+              <w:t xml:space="preserve">350</w:t>
+            </w:r>
+          </w:p>
+        </w:tc>
+        <w:tc>
+          <w:tcPr/>
+          <w:p>
+            <w:pPr>
+              <w:pStyle w:val="Compact"/>
+              <w:jc w:val="center"/>
+            </w:pPr>
+            <w:r>
+              <w:t xml:space="preserve">3.0</w:t>
+            </w:r>
+          </w:p>
+        </w:tc>
+      </w:tr>
+      <w:tr>
+        <w:tc>
+          <w:tcPr/>
+          <w:p>
+            <w:pPr>
+              <w:pStyle w:val="Compact"/>
+              <w:jc w:val="left"/>
+            </w:pPr>
+            <w:r>
+              <w:t xml:space="preserve">Olive</w:t>
+            </w:r>
+          </w:p>
+        </w:tc>
+        <w:tc>
+          <w:tcPr/>
+          <w:p>
+            <w:pPr>
+              <w:pStyle w:val="Compact"/>
+              <w:jc w:val="center"/>
+            </w:pPr>
+            <w:r>
+              <w:t xml:space="preserve">600</w:t>
+            </w:r>
+          </w:p>
+        </w:tc>
+        <w:tc>
+          <w:tcPr/>
+          <w:p>
+            <w:pPr>
+              <w:pStyle w:val="Compact"/>
+              <w:jc w:val="center"/>
+            </w:pPr>
+            <w:r>
+              <w:t xml:space="preserve">5.0</w:t>
+            </w:r>
+          </w:p>
+        </w:tc>
+      </w:tr>
+      <w:tr>
+        <w:tc>
+          <w:tcPr/>
+          <w:p>
+            <w:pPr>
+              <w:pStyle w:val="Compact"/>
+              <w:jc w:val="left"/>
+            </w:pPr>
+            <w:r>
+              <w:t xml:space="preserve">Eucalyptus</w:t>
+            </w:r>
+          </w:p>
+        </w:tc>
+        <w:tc>
+          <w:tcPr/>
+          <w:p>
+            <w:pPr>
+              <w:pStyle w:val="Compact"/>
+              <w:jc w:val="center"/>
+            </w:pPr>
+            <w:r>
+              <w:t xml:space="preserve">250</w:t>
+            </w:r>
+          </w:p>
+        </w:tc>
+        <w:tc>
+          <w:tcPr/>
+          <w:p>
+            <w:pPr>
+              <w:pStyle w:val="Compact"/>
+              <w:jc w:val="center"/>
+            </w:pPr>
+            <w:r>
+              <w:t xml:space="preserve">2.0</w:t>
+            </w:r>
+          </w:p>
+        </w:tc>
+      </w:tr>
     </w:tbl>
     <w:bookmarkEnd w:id="52"/>
     <w:bookmarkEnd w:id="53"/>
@@ -13153,7 +13267,7 @@
         <w:t xml:space="preserve"> </w:t>
       </w:r>
       <w:r>
-        <w:t xml:space="preserve">lists the temporal parameters for the seven genera modeled on campus, derived from Bay Area regional data</w:t>
+        <w:t xml:space="preserve">lists the temporal parameters for the modeled genera, derived from Bay Area regional data</w:t>
       </w:r>
       <w:r>
         <w:t xml:space="preserve"> </w:t>
@@ -13169,7 +13283,7 @@
         <w:t xml:space="preserve">Cedrus</w:t>
       </w:r>
       <w:r>
-        <w:t xml:space="preserve">) is the notable exception, pollinating in the fall (October–December), so it produces a secondary autumn peak that the other genera do not.</w:t>
+        <w:t xml:space="preserve">) is a notable exception, pollinating in the fall (October–December) and producing a secondary autumn peak, while the campus-specific sets differ (e.g. Stanford adds Canary Island Palm, Olive, and Eucalyptus).</w:t>
       </w:r>
     </w:p>
     <w:bookmarkStart w:id="54" w:name="tab:species"/>
@@ -13852,6 +13966,228 @@
           </w:p>
         </w:tc>
       </w:tr>
+      <w:tr>
+        <w:tc>
+          <w:tcPr/>
+          <w:p>
+            <w:pPr>
+              <w:pStyle w:val="Compact"/>
+              <w:jc w:val="left"/>
+            </w:pPr>
+            <w:r>
+              <w:t xml:space="preserve">Canary Island Palm</w:t>
+            </w:r>
+          </w:p>
+        </w:tc>
+        <w:tc>
+          <w:tcPr/>
+          <w:p>
+            <w:pPr>
+              <w:pStyle w:val="Compact"/>
+              <w:jc w:val="center"/>
+            </w:pPr>
+            <w:r>
+              <w:t xml:space="preserve">74</w:t>
+            </w:r>
+          </w:p>
+        </w:tc>
+        <w:tc>
+          <w:tcPr/>
+          <w:p>
+            <w:pPr>
+              <w:pStyle w:val="Compact"/>
+              <w:jc w:val="center"/>
+            </w:pPr>
+            <w:r>
+              <w:t xml:space="preserve">135</w:t>
+            </w:r>
+          </w:p>
+        </w:tc>
+        <w:tc>
+          <w:tcPr/>
+          <w:p>
+            <w:pPr>
+              <w:pStyle w:val="Compact"/>
+              <w:jc w:val="center"/>
+            </w:pPr>
+            <w:r>
+              <w:t xml:space="preserve">105</w:t>
+            </w:r>
+          </w:p>
+        </w:tc>
+        <w:tc>
+          <w:tcPr/>
+          <w:p>
+            <w:pPr>
+              <w:pStyle w:val="Compact"/>
+              <w:jc w:val="center"/>
+            </w:pPr>
+            <w:r>
+              <w:t xml:space="preserve">20</w:t>
+            </w:r>
+          </w:p>
+        </w:tc>
+        <w:tc>
+          <w:tcPr/>
+          <w:p>
+            <w:pPr>
+              <w:pStyle w:val="Compact"/>
+              <w:jc w:val="center"/>
+            </w:pPr>
+            <w:r>
+              <w:t xml:space="preserve">3.0</w:t>
+            </w:r>
+          </w:p>
+        </w:tc>
+      </w:tr>
+      <w:tr>
+        <w:tc>
+          <w:tcPr/>
+          <w:p>
+            <w:pPr>
+              <w:pStyle w:val="Compact"/>
+              <w:jc w:val="left"/>
+            </w:pPr>
+            <w:r>
+              <w:t xml:space="preserve">Olive</w:t>
+            </w:r>
+          </w:p>
+        </w:tc>
+        <w:tc>
+          <w:tcPr/>
+          <w:p>
+            <w:pPr>
+              <w:pStyle w:val="Compact"/>
+              <w:jc w:val="center"/>
+            </w:pPr>
+            <w:r>
+              <w:t xml:space="preserve">105</w:t>
+            </w:r>
+          </w:p>
+        </w:tc>
+        <w:tc>
+          <w:tcPr/>
+          <w:p>
+            <w:pPr>
+              <w:pStyle w:val="Compact"/>
+              <w:jc w:val="center"/>
+            </w:pPr>
+            <w:r>
+              <w:t xml:space="preserve">150</w:t>
+            </w:r>
+          </w:p>
+        </w:tc>
+        <w:tc>
+          <w:tcPr/>
+          <w:p>
+            <w:pPr>
+              <w:pStyle w:val="Compact"/>
+              <w:jc w:val="center"/>
+            </w:pPr>
+            <w:r>
+              <w:t xml:space="preserve">128</w:t>
+            </w:r>
+          </w:p>
+        </w:tc>
+        <w:tc>
+          <w:tcPr/>
+          <w:p>
+            <w:pPr>
+              <w:pStyle w:val="Compact"/>
+              <w:jc w:val="center"/>
+            </w:pPr>
+            <w:r>
+              <w:t xml:space="preserve">18</w:t>
+            </w:r>
+          </w:p>
+        </w:tc>
+        <w:tc>
+          <w:tcPr/>
+          <w:p>
+            <w:pPr>
+              <w:pStyle w:val="Compact"/>
+              <w:jc w:val="center"/>
+            </w:pPr>
+            <w:r>
+              <w:t xml:space="preserve">5.0</w:t>
+            </w:r>
+          </w:p>
+        </w:tc>
+      </w:tr>
+      <w:tr>
+        <w:tc>
+          <w:tcPr/>
+          <w:p>
+            <w:pPr>
+              <w:pStyle w:val="Compact"/>
+              <w:jc w:val="left"/>
+            </w:pPr>
+            <w:r>
+              <w:t xml:space="preserve">Eucalyptus</w:t>
+            </w:r>
+          </w:p>
+        </w:tc>
+        <w:tc>
+          <w:tcPr/>
+          <w:p>
+            <w:pPr>
+              <w:pStyle w:val="Compact"/>
+              <w:jc w:val="center"/>
+            </w:pPr>
+            <w:r>
+              <w:t xml:space="preserve">1</w:t>
+            </w:r>
+          </w:p>
+        </w:tc>
+        <w:tc>
+          <w:tcPr/>
+          <w:p>
+            <w:pPr>
+              <w:pStyle w:val="Compact"/>
+              <w:jc w:val="center"/>
+            </w:pPr>
+            <w:r>
+              <w:t xml:space="preserve">120</w:t>
+            </w:r>
+          </w:p>
+        </w:tc>
+        <w:tc>
+          <w:tcPr/>
+          <w:p>
+            <w:pPr>
+              <w:pStyle w:val="Compact"/>
+              <w:jc w:val="center"/>
+            </w:pPr>
+            <w:r>
+              <w:t xml:space="preserve">60</w:t>
+            </w:r>
+          </w:p>
+        </w:tc>
+        <w:tc>
+          <w:tcPr/>
+          <w:p>
+            <w:pPr>
+              <w:pStyle w:val="Compact"/>
+              <w:jc w:val="center"/>
+            </w:pPr>
+            <w:r>
+              <w:t xml:space="preserve">30</w:t>
+            </w:r>
+          </w:p>
+        </w:tc>
+        <w:tc>
+          <w:tcPr/>
+          <w:p>
+            <w:pPr>
+              <w:pStyle w:val="Compact"/>
+              <w:jc w:val="center"/>
+            </w:pPr>
+            <w:r>
+              <w:t xml:space="preserve">2.0</w:t>
+            </w:r>
+          </w:p>
+        </w:tc>
+      </w:tr>
     </w:tbl>
     <w:bookmarkEnd w:id="54"/>
     <w:bookmarkEnd w:id="55"/>
@@ -14234,7 +14570,7 @@
     <w:bookmarkEnd w:id="59"/>
     <w:bookmarkEnd w:id="60"/>
     <w:bookmarkEnd w:id="61"/>
-    <w:bookmarkStart w:id="69" w:name="satellite-based-vegetation-detection"/>
+    <w:bookmarkStart w:id="70" w:name="satellite-based-vegetation-detection"/>
     <w:p>
       <w:pPr>
         <w:pStyle w:val="Heading1"/>
@@ -15032,8 +15368,37 @@
       </w:r>
     </w:p>
     <w:bookmarkEnd w:id="68"/>
+    <w:bookmarkStart w:id="69" w:name="sec:overlapfilter"/>
+    <w:p>
+      <w:pPr>
+        <w:pStyle w:val="Heading2"/>
+      </w:pPr>
+      <w:r>
+        <w:t xml:space="preserve">Rooftop-Overlap Filtering</w:t>
+      </w:r>
+    </w:p>
+    <w:p>
+      <w:pPr>
+        <w:pStyle w:val="FirstParagraph"/>
+      </w:pPr>
+      <w:r>
+        <w:t xml:space="preserve">Color-based canopy detection occasionally fires on rooftops—warm or textured roof pixels can resemble vegetation—especially on dense urban campuses. After buildings are detected, we therefore prune tree candidates geometrically: a canopy is discarded if more than 50% of its disk area (estimated by area-weighted sampling of the disk against the building polygons) lies inside any detected footprint. This is applied only where needed; on the densely built Stanford core it removed a substantial share of the raw canopies (Section </w:t>
+      </w:r>
+      <w:hyperlink w:anchor="sec:results">
+        <w:r>
+          <w:rPr>
+            <w:rStyle w:val="Hyperlink"/>
+          </w:rPr>
+          <w:t xml:space="preserve">6</w:t>
+        </w:r>
+      </w:hyperlink>
+      <w:r>
+        <w:t xml:space="preserve">), leaving trees in courtyards, along streets, and on open ground while eliminating rooftop false positives.</w:t>
+      </w:r>
+    </w:p>
     <w:bookmarkEnd w:id="69"/>
-    <w:bookmarkStart w:id="72" w:name="exposure-assessment"/>
+    <w:bookmarkEnd w:id="70"/>
+    <w:bookmarkStart w:id="73" w:name="exposure-assessment"/>
     <w:p>
       <w:pPr>
         <w:pStyle w:val="Heading1"/>
@@ -15042,7 +15407,7 @@
         <w:t xml:space="preserve">Exposure Assessment</w:t>
       </w:r>
     </w:p>
-    <w:bookmarkStart w:id="70" w:name="path-integrated-dose"/>
+    <w:bookmarkStart w:id="71" w:name="path-integrated-dose"/>
     <w:p>
       <w:pPr>
         <w:pStyle w:val="Heading2"/>
@@ -15313,8 +15678,8 @@
         </m:oMath>
       </m:oMathPara>
     </w:p>
-    <w:bookmarkEnd w:id="70"/>
-    <w:bookmarkStart w:id="71" w:name="clinical-risk-mapping"/>
+    <w:bookmarkEnd w:id="71"/>
+    <w:bookmarkStart w:id="72" w:name="clinical-risk-mapping"/>
     <w:p>
       <w:pPr>
         <w:pStyle w:val="Heading2"/>
@@ -15422,9 +15787,9 @@
         <w:t xml:space="preserve">).</w:t>
       </w:r>
     </w:p>
-    <w:bookmarkEnd w:id="71"/>
     <w:bookmarkEnd w:id="72"/>
-    <w:bookmarkStart w:id="76" w:name="sec:results"/>
+    <w:bookmarkEnd w:id="73"/>
+    <w:bookmarkStart w:id="77" w:name="sec:results"/>
     <w:p>
       <w:pPr>
         <w:pStyle w:val="Heading1"/>
@@ -15433,7 +15798,7 @@
         <w:t xml:space="preserve">Results</w:t>
       </w:r>
     </w:p>
-    <w:bookmarkStart w:id="73" w:name="detection-performance"/>
+    <w:bookmarkStart w:id="74" w:name="detection-performance"/>
     <w:p>
       <w:pPr>
         <w:pStyle w:val="Heading2"/>
@@ -15564,11 +15929,84 @@
         <w:t xml:space="preserve"> </w:t>
       </w:r>
       <w:r>
-        <w:t xml:space="preserve">tree canopies, giving comprehensive coverage of the full campus. Detection and imagery are cached per campus, so no machine-learning model runs on the live server.</w:t>
-      </w:r>
-    </w:p>
-    <w:bookmarkEnd w:id="73"/>
-    <w:bookmarkStart w:id="74" w:name="seasonal-concentration"/>
+        <w:t xml:space="preserve">tree canopies, giving comprehensive coverage of the full campus. Because tree detection on the dense Stanford imagery placed many canopy candidates on top of rooftops, we apply a geometric filter after building detection: a candidate tree is discarded when more than half of its canopy disk area falls inside any detected building footprint (evaluated by area-weighted sampling of the disk against the building polygons). This removed roughly 43% of the raw Stanford canopies (from</w:t>
+      </w:r>
+      <w:r>
+        <w:t xml:space="preserve"> </w:t>
+      </w:r>
+      <m:oMath>
+        <m:r>
+          <m:rPr>
+            <m:sty m:val="p"/>
+          </m:rPr>
+          <m:t>∼</m:t>
+        </m:r>
+      </m:oMath>
+      <w:r>
+        <w:t xml:space="preserve">9</w:t>
+      </w:r>
+      <w:r>
+        <w:t xml:space="preserve">,</w:t>
+      </w:r>
+      <w:r>
+        <w:t xml:space="preserve">900 to</w:t>
+      </w:r>
+      <w:r>
+        <w:t xml:space="preserve"> </w:t>
+      </w:r>
+      <m:oMath>
+        <m:r>
+          <m:rPr>
+            <m:sty m:val="p"/>
+          </m:rPr>
+          <m:t>∼</m:t>
+        </m:r>
+      </m:oMath>
+      <w:r>
+        <w:t xml:space="preserve">5</w:t>
+      </w:r>
+      <w:r>
+        <w:t xml:space="preserve">,</w:t>
+      </w:r>
+      <w:r>
+        <w:t xml:space="preserve">650), eliminating rooftop false positives while retaining trees in courtyards, streets, and open ground. The surviving Stanford canopies are labeled against the six most abundant genera reported for the campus</w:t>
+      </w:r>
+      <w:r>
+        <w:t xml:space="preserve"> </w:t>
+      </w:r>
+      <w:r>
+        <w:t xml:space="preserve">—Coast Live Oak (the single most numerous species,</w:t>
+      </w:r>
+      <w:r>
+        <w:t xml:space="preserve"> </w:t>
+      </w:r>
+      <m:oMath>
+        <m:r>
+          <m:rPr>
+            <m:sty m:val="p"/>
+          </m:rPr>
+          <m:t>∼</m:t>
+        </m:r>
+      </m:oMath>
+      <w:r>
+        <w:t xml:space="preserve">40% of the population), Canary Island Palm, Eucalyptus, Coast Redwood, Valley Oak, and Olive—with all remaining genera assigned to</w:t>
+      </w:r>
+      <w:r>
+        <w:t xml:space="preserve"> </w:t>
+      </w:r>
+      <w:r>
+        <w:rPr>
+          <w:i/>
+          <w:iCs/>
+        </w:rPr>
+        <w:t xml:space="preserve">Other</w:t>
+      </w:r>
+      <w:r>
+        <w:t xml:space="preserve">. Detection and imagery are cached per campus, so no machine-learning model runs on the live server.</w:t>
+      </w:r>
+    </w:p>
+    <w:bookmarkEnd w:id="74"/>
+    <w:bookmarkStart w:id="75" w:name="seasonal-concentration"/>
     <w:p>
       <w:pPr>
         <w:pStyle w:val="Heading2"/>
@@ -15813,8 +16251,8 @@
         <w:t xml:space="preserve">; all species dormant</w:t>
       </w:r>
     </w:p>
-    <w:bookmarkEnd w:id="74"/>
-    <w:bookmarkStart w:id="75" w:name="spatial-patterns"/>
+    <w:bookmarkEnd w:id="75"/>
+    <w:bookmarkStart w:id="76" w:name="spatial-patterns"/>
     <w:p>
       <w:pPr>
         <w:pStyle w:val="Heading2"/>
@@ -15831,9 +16269,9 @@
         <w:t xml:space="preserve">The concentration field exhibits: (i) plumes bending along the potential-flow streamlines as the wind is diverted around buildings; (ii) zero concentration over building footprints; (iii) locally elevated concentration where flow is channeled between closely spaced buildings; and (iv) elevated concentrations in oak-dense corridors.</w:t>
       </w:r>
     </w:p>
-    <w:bookmarkEnd w:id="75"/>
     <w:bookmarkEnd w:id="76"/>
-    <w:bookmarkStart w:id="77" w:name="discussion"/>
+    <w:bookmarkEnd w:id="77"/>
+    <w:bookmarkStart w:id="78" w:name="discussion"/>
     <w:p>
       <w:pPr>
         <w:pStyle w:val="Heading1"/>
@@ -15932,8 +16370,8 @@
         <w:t xml:space="preserve">spring peak that constitutes the actual high-risk period.</w:t>
       </w:r>
     </w:p>
-    <w:bookmarkEnd w:id="77"/>
-    <w:bookmarkStart w:id="78" w:name="conclusion"/>
+    <w:bookmarkEnd w:id="78"/>
+    <w:bookmarkStart w:id="79" w:name="conclusion"/>
     <w:p>
       <w:pPr>
         <w:pStyle w:val="Heading1"/>
@@ -15950,8 +16388,8 @@
         <w:t xml:space="preserve">We built a complete pipeline for hyperlocal pollen dispersion modeling, from satellite-based source identification, through a potential-flow wind field coupled to Gaussian-plume transport, to path-integrated exposure. The system resolves concentration gradients at meter scale across two campuses of contrasting scale—Gunn High School and the Stanford core—with thousands of individually mapped trees and buildings, and recomputes the full field in a few seconds as wind and season change. Whether the routes it recommends actually reduce measured exposure is the validation step that remains.</w:t>
       </w:r>
     </w:p>
-    <w:bookmarkEnd w:id="78"/>
-    <w:bookmarkStart w:id="81" w:name="data-availability"/>
+    <w:bookmarkEnd w:id="79"/>
+    <w:bookmarkStart w:id="82" w:name="data-availability"/>
     <w:p>
       <w:pPr>
         <w:pStyle w:val="Heading1"/>
@@ -15970,7 +16408,7 @@
       <w:r>
         <w:t xml:space="preserve"> </w:t>
       </w:r>
-      <w:hyperlink r:id="rId79">
+      <w:hyperlink r:id="rId80">
         <w:r>
           <w:rPr>
             <w:rStyle w:val="Hyperlink"/>
@@ -15984,7 +16422,7 @@
       <w:r>
         <w:t xml:space="preserve"> </w:t>
       </w:r>
-      <w:hyperlink r:id="rId80">
+      <w:hyperlink r:id="rId81">
         <w:r>
           <w:rPr>
             <w:rStyle w:val="Hyperlink"/>
@@ -15996,8 +16434,8 @@
         <w:t xml:space="preserve">. The tree inventory is derived from the PAUSD 2009 arborist survey supplemented by satellite detection.</w:t>
       </w:r>
     </w:p>
-    <w:bookmarkEnd w:id="81"/>
-    <w:bookmarkStart w:id="82" w:name="acknowledgments"/>
+    <w:bookmarkEnd w:id="82"/>
+    <w:bookmarkStart w:id="85" w:name="acknowledgments"/>
     <w:p>
       <w:pPr>
         <w:pStyle w:val="Heading1"/>
@@ -16317,7 +16755,76 @@
         <w:t xml:space="preserve">Technical report, PAUSD Facilities Department, 2009.</w:t>
       </w:r>
     </w:p>
-    <w:bookmarkEnd w:id="82"/>
+    <w:p>
+      <w:pPr>
+        <w:pStyle w:val="BodyText"/>
+      </w:pPr>
+      <w:r>
+        <w:t xml:space="preserve">Trees of Stanford and Environs.</w:t>
+      </w:r>
+      <w:r>
+        <w:t xml:space="preserve"> </w:t>
+      </w:r>
+      <w:r>
+        <w:t xml:space="preserve">Encyclopedia of Trees, Shrubs, and Vines (based on R. Bracewell,</w:t>
+      </w:r>
+      <w:r>
+        <w:t xml:space="preserve"> </w:t>
+      </w:r>
+      <w:r>
+        <w:rPr>
+          <w:i/>
+          <w:iCs/>
+        </w:rPr>
+        <w:t xml:space="preserve">Trees of Stanford and Environs</w:t>
+      </w:r>
+      <w:r>
+        <w:t xml:space="preserve">).</w:t>
+      </w:r>
+      <w:r>
+        <w:t xml:space="preserve"> </w:t>
+      </w:r>
+      <w:hyperlink r:id="rId83">
+        <w:r>
+          <w:rPr>
+            <w:rStyle w:val="Hyperlink"/>
+          </w:rPr>
+          <w:t xml:space="preserve">https://trees.stanford.edu/</w:t>
+        </w:r>
+      </w:hyperlink>
+      <w:r>
+        <w:t xml:space="preserve">, accessed 2026.</w:t>
+      </w:r>
+    </w:p>
+    <w:p>
+      <w:pPr>
+        <w:pStyle w:val="BodyText"/>
+      </w:pPr>
+      <w:r>
+        <w:t xml:space="preserve">Stanford Land, Buildings &amp; Real Estate, Facilities Operations.</w:t>
+      </w:r>
+      <w:r>
+        <w:t xml:space="preserve"> </w:t>
+      </w:r>
+      <w:r>
+        <w:t xml:space="preserve">Stanford Trees: campus urban forest inventory.</w:t>
+      </w:r>
+      <w:r>
+        <w:t xml:space="preserve"> </w:t>
+      </w:r>
+      <w:hyperlink r:id="rId84">
+        <w:r>
+          <w:rPr>
+            <w:rStyle w:val="Hyperlink"/>
+          </w:rPr>
+          <w:t xml:space="preserve">https://facops.stanford.edu/stanford-trees</w:t>
+        </w:r>
+      </w:hyperlink>
+      <w:r>
+        <w:t xml:space="preserve">, accessed 2026.</w:t>
+      </w:r>
+    </w:p>
+    <w:bookmarkEnd w:id="85"/>
     <w:sectPr>
       <w:footnotePr>
         <w:numRestart w:val="eachSect"/>

</xml_diff>